<commit_message>
modo noche y chatbot integrado
</commit_message>
<xml_diff>
--- a/Proceso de Apertura de la APP de manera Local.docx
+++ b/Proceso de Apertura de la APP de manera Local.docx
@@ -2,17 +2,59 @@
 <file path=word/document.xml><?xml version="1.0" encoding="utf-8"?>
 <w:document xmlns:wpc="http://schemas.microsoft.com/office/word/2010/wordprocessingCanvas" xmlns:cx="http://schemas.microsoft.com/office/drawing/2014/chartex" xmlns:cx1="http://schemas.microsoft.com/office/drawing/2015/9/8/chartex" xmlns:cx2="http://schemas.microsoft.com/office/drawing/2015/10/21/chartex" xmlns:cx3="http://schemas.microsoft.com/office/drawing/2016/5/9/chartex" xmlns:cx4="http://schemas.microsoft.com/office/drawing/2016/5/10/chartex" xmlns:cx5="http://schemas.microsoft.com/office/drawing/2016/5/11/chartex" xmlns:cx6="http://schemas.microsoft.com/office/drawing/2016/5/12/chartex" xmlns:cx7="http://schemas.microsoft.com/office/drawing/2016/5/13/chartex" xmlns:cx8="http://schemas.microsoft.com/office/drawing/2016/5/14/chartex" xmlns:mc="http://schemas.openxmlformats.org/markup-compatibility/2006" xmlns:aink="http://schemas.microsoft.com/office/drawing/2016/ink" xmlns:am3d="http://schemas.microsoft.com/office/drawing/2017/model3d" xmlns:o="urn:schemas-microsoft-com:office:office" xmlns:oel="http://schemas.microsoft.com/office/2019/extlst" xmlns:r="http://schemas.openxmlformats.org/officeDocument/2006/relationships" xmlns:m="http://schemas.openxmlformats.org/officeDocument/2006/math" xmlns:v="urn:schemas-microsoft-com:vml" xmlns:wp14="http://schemas.microsoft.com/office/word/2010/wordprocessingDrawing" xmlns:wp="http://schemas.openxmlformats.org/drawingml/2006/wordprocessingDrawing" xmlns:w10="urn:schemas-microsoft-com:office:word" xmlns:w="http://schemas.openxmlformats.org/wordprocessingml/2006/main" xmlns:w14="http://schemas.microsoft.com/office/word/2010/wordml" xmlns:w15="http://schemas.microsoft.com/office/word/2012/wordml" xmlns:w16cex="http://schemas.microsoft.com/office/word/2018/wordml/cex" xmlns:w16cid="http://schemas.microsoft.com/office/word/2016/wordml/cid" xmlns:w16="http://schemas.microsoft.com/office/word/2018/wordml" xmlns:w16du="http://schemas.microsoft.com/office/word/2023/wordml/word16du" xmlns:w16sdtdh="http://schemas.microsoft.com/office/word/2020/wordml/sdtdatahash" xmlns:w16sdtfl="http://schemas.microsoft.com/office/word/2024/wordml/sdtformatlock" xmlns:w16se="http://schemas.microsoft.com/office/word/2015/wordml/symex" xmlns:wpg="http://schemas.microsoft.com/office/word/2010/wordprocessingGroup" xmlns:wpi="http://schemas.microsoft.com/office/word/2010/wordprocessingInk" xmlns:wne="http://schemas.microsoft.com/office/word/2006/wordml" xmlns:wps="http://schemas.microsoft.com/office/word/2010/wordprocessingShape" mc:Ignorable="w14 w15 w16se w16cid w16 w16cex w16sdtdh w16sdtfl w16du wp14">
   <w:body>
-    <w:p>
-      <w:r>
-        <w:t xml:space="preserve">Para ejecutar la aplicación por tu cuenta, simplemente </w:t>
-      </w:r>
-      <w:proofErr w:type="spellStart"/>
-      <w:r>
-        <w:t>necesitás</w:t>
-      </w:r>
-      <w:proofErr w:type="spellEnd"/>
-      <w:r>
-        <w:t xml:space="preserve"> usar la terminal (consola) de tu computadora.</w:t>
+    <w:p/>
+    <w:p>
+      <w:r>
+        <w:t>ESTA SERÍA LA TERMINAL ABIERTA:</w:t>
+      </w:r>
+      <w:r>
+        <w:br/>
+      </w:r>
+      <w:r>
+        <w:br/>
+      </w:r>
+      <w:r>
+        <w:drawing>
+          <wp:inline distT="0" distB="0" distL="0" distR="0" wp14:anchorId="697E5807" wp14:editId="485D7D4A">
+            <wp:extent cx="5400040" cy="3027045"/>
+            <wp:effectExtent l="0" t="0" r="0" b="1905"/>
+            <wp:docPr id="730335228" name="Imagen 1"/>
+            <wp:cNvGraphicFramePr>
+              <a:graphicFrameLocks xmlns:a="http://schemas.openxmlformats.org/drawingml/2006/main" noChangeAspect="1"/>
+            </wp:cNvGraphicFramePr>
+            <a:graphic xmlns:a="http://schemas.openxmlformats.org/drawingml/2006/main">
+              <a:graphicData uri="http://schemas.openxmlformats.org/drawingml/2006/picture">
+                <pic:pic xmlns:pic="http://schemas.openxmlformats.org/drawingml/2006/picture">
+                  <pic:nvPicPr>
+                    <pic:cNvPr id="730335228" name=""/>
+                    <pic:cNvPicPr/>
+                  </pic:nvPicPr>
+                  <pic:blipFill>
+                    <a:blip r:embed="rId5"/>
+                    <a:stretch>
+                      <a:fillRect/>
+                    </a:stretch>
+                  </pic:blipFill>
+                  <pic:spPr>
+                    <a:xfrm>
+                      <a:off x="0" y="0"/>
+                      <a:ext cx="5400040" cy="3027045"/>
+                    </a:xfrm>
+                    <a:prstGeom prst="rect">
+                      <a:avLst/>
+                    </a:prstGeom>
+                  </pic:spPr>
+                </pic:pic>
+              </a:graphicData>
+            </a:graphic>
+          </wp:inline>
+        </w:drawing>
+      </w:r>
+    </w:p>
+    <w:p/>
+    <w:p>
+      <w:r>
+        <w:t>Para ejecutar la aplicación por tu cuenta, simplemente necesitás usar la terminal (consola) de tu computadora.</w:t>
       </w:r>
     </w:p>
     <w:p>
@@ -107,158 +149,16 @@
       </w:r>
     </w:p>
     <w:p>
-      <w:proofErr w:type="spellStart"/>
       <w:r>
         <w:t>powershell</w:t>
       </w:r>
-      <w:proofErr w:type="spellEnd"/>
     </w:p>
     <w:p>
       <w:r>
         <w:rPr>
           <w:highlight w:val="yellow"/>
         </w:rPr>
-        <w:t>cd "c:\Users\Usuario\Documents\MIS DOC\</w:t>
-      </w:r>
-      <w:proofErr w:type="gramStart"/>
-      <w:r>
-        <w:rPr>
-          <w:highlight w:val="yellow"/>
-        </w:rPr>
-        <w:t>P  R</w:t>
-      </w:r>
-      <w:proofErr w:type="gramEnd"/>
-      <w:r>
-        <w:rPr>
-          <w:highlight w:val="yellow"/>
-        </w:rPr>
-        <w:t xml:space="preserve">  </w:t>
-      </w:r>
-      <w:proofErr w:type="gramStart"/>
-      <w:r>
-        <w:rPr>
-          <w:highlight w:val="yellow"/>
-        </w:rPr>
-        <w:t>E  S</w:t>
-      </w:r>
-      <w:proofErr w:type="gramEnd"/>
-      <w:r>
-        <w:rPr>
-          <w:highlight w:val="yellow"/>
-        </w:rPr>
-        <w:t xml:space="preserve">  </w:t>
-      </w:r>
-      <w:proofErr w:type="gramStart"/>
-      <w:r>
-        <w:rPr>
-          <w:highlight w:val="yellow"/>
-        </w:rPr>
-        <w:t>U  P</w:t>
-      </w:r>
-      <w:proofErr w:type="gramEnd"/>
-      <w:r>
-        <w:rPr>
-          <w:highlight w:val="yellow"/>
-        </w:rPr>
-        <w:t xml:space="preserve">  </w:t>
-      </w:r>
-      <w:proofErr w:type="gramStart"/>
-      <w:r>
-        <w:rPr>
-          <w:highlight w:val="yellow"/>
-        </w:rPr>
-        <w:t>U  E</w:t>
-      </w:r>
-      <w:proofErr w:type="gramEnd"/>
-      <w:r>
-        <w:rPr>
-          <w:highlight w:val="yellow"/>
-        </w:rPr>
-        <w:t xml:space="preserve">  </w:t>
-      </w:r>
-      <w:proofErr w:type="gramStart"/>
-      <w:r>
-        <w:rPr>
-          <w:highlight w:val="yellow"/>
-        </w:rPr>
-        <w:t>S  T</w:t>
-      </w:r>
-      <w:proofErr w:type="gramEnd"/>
-      <w:r>
-        <w:rPr>
-          <w:highlight w:val="yellow"/>
-        </w:rPr>
-        <w:t xml:space="preserve">  O    </w:t>
-      </w:r>
-      <w:proofErr w:type="gramStart"/>
-      <w:r>
-        <w:rPr>
-          <w:highlight w:val="yellow"/>
-        </w:rPr>
-        <w:t>P  E</w:t>
-      </w:r>
-      <w:proofErr w:type="gramEnd"/>
-      <w:r>
-        <w:rPr>
-          <w:highlight w:val="yellow"/>
-        </w:rPr>
-        <w:t xml:space="preserve">  </w:t>
-      </w:r>
-      <w:proofErr w:type="gramStart"/>
-      <w:r>
-        <w:rPr>
-          <w:highlight w:val="yellow"/>
-        </w:rPr>
-        <w:t>R  S</w:t>
-      </w:r>
-      <w:proofErr w:type="gramEnd"/>
-      <w:r>
-        <w:rPr>
-          <w:highlight w:val="yellow"/>
-        </w:rPr>
-        <w:t xml:space="preserve">  </w:t>
-      </w:r>
-      <w:proofErr w:type="gramStart"/>
-      <w:r>
-        <w:rPr>
-          <w:highlight w:val="yellow"/>
-        </w:rPr>
-        <w:t>O  N</w:t>
-      </w:r>
-      <w:proofErr w:type="gramEnd"/>
-      <w:r>
-        <w:rPr>
-          <w:highlight w:val="yellow"/>
-        </w:rPr>
-        <w:t xml:space="preserve">  </w:t>
-      </w:r>
-      <w:proofErr w:type="gramStart"/>
-      <w:r>
-        <w:rPr>
-          <w:highlight w:val="yellow"/>
-        </w:rPr>
-        <w:t>A  L</w:t>
-      </w:r>
-      <w:proofErr w:type="gramEnd"/>
-      <w:r>
-        <w:rPr>
-          <w:highlight w:val="yellow"/>
-        </w:rPr>
-        <w:t>\</w:t>
-      </w:r>
-      <w:proofErr w:type="spellStart"/>
-      <w:r>
-        <w:rPr>
-          <w:highlight w:val="yellow"/>
-        </w:rPr>
-        <w:t>misfinanzasvhv</w:t>
-      </w:r>
-      <w:proofErr w:type="spellEnd"/>
-      <w:r>
-        <w:rPr>
-          <w:highlight w:val="yellow"/>
-        </w:rPr>
-        <w:t>"</w:t>
+        <w:t>cd "c:\Users\Usuario\Documents\MIS DOC\P  R  E  S  U  P  U  E  S  T  O    P  E  R  S  O  N  A  L\misfinanzasvhv"</w:t>
       </w:r>
     </w:p>
     <w:p>
@@ -282,35 +182,17 @@
       </w:r>
     </w:p>
     <w:p>
-      <w:proofErr w:type="spellStart"/>
       <w:r>
         <w:t>powershell</w:t>
       </w:r>
-      <w:proofErr w:type="spellEnd"/>
-    </w:p>
-    <w:p>
-      <w:proofErr w:type="spellStart"/>
+    </w:p>
+    <w:p>
       <w:r>
         <w:rPr>
           <w:highlight w:val="yellow"/>
         </w:rPr>
-        <w:t>npm</w:t>
-      </w:r>
-      <w:proofErr w:type="spellEnd"/>
-      <w:r>
-        <w:rPr>
-          <w:highlight w:val="yellow"/>
-        </w:rPr>
-        <w:t xml:space="preserve"> run </w:t>
-      </w:r>
-      <w:proofErr w:type="spellStart"/>
-      <w:r>
-        <w:rPr>
-          <w:highlight w:val="yellow"/>
-        </w:rPr>
-        <w:t>dev</w:t>
-      </w:r>
-      <w:proofErr w:type="spellEnd"/>
+        <w:t>npm run dev</w:t>
+      </w:r>
     </w:p>
     <w:p>
       <w:pPr>
@@ -334,6 +216,7 @@
     </w:p>
     <w:p>
       <w:r>
+        <w:lastRenderedPageBreak/>
         <w:t>Ready in ...</w:t>
       </w:r>
     </w:p>
@@ -357,7 +240,7 @@
         </w:rPr>
         <w:t>abre tu navegador (Chrome, Edge, etc.) y entra a: </w:t>
       </w:r>
-      <w:hyperlink r:id="rId5" w:history="1">
+      <w:hyperlink r:id="rId6" w:history="1">
         <w:r>
           <w:rPr>
             <w:rStyle w:val="Hipervnculo"/>
@@ -408,13 +291,8 @@
       </w:r>
     </w:p>
     <w:p>
-      <w:proofErr w:type="spellStart"/>
-      <w:r>
-        <w:t>Ctrl</w:t>
-      </w:r>
-      <w:proofErr w:type="spellEnd"/>
-      <w:r>
-        <w:t xml:space="preserve"> + C</w:t>
+      <w:r>
+        <w:t>Ctrl + C</w:t>
       </w:r>
     </w:p>
     <w:p>

</xml_diff>